<commit_message>
v1.0.6 - official .exe release
### New Features
-

### Fixed / Improved
-

### Changed
- read.me project title
</commit_message>
<xml_diff>
--- a/docs/0000.00.01_repo-description-templates-and-assets/1.2.1_README_project_template_preview.docx
+++ b/docs/0000.00.01_repo-description-templates-and-assets/1.2.1_README_project_template_preview.docx
@@ -1,6 +1,6 @@
 
 <file path=word/document.xml><?xml version="1.0" encoding="utf-8"?>
-<w:document xmlns:wpc="http://schemas.microsoft.com/office/word/2010/wordprocessingCanvas" xmlns:cx="http://schemas.microsoft.com/office/drawing/2014/chartex" xmlns:cx1="http://schemas.microsoft.com/office/drawing/2015/9/8/chartex" xmlns:cx2="http://schemas.microsoft.com/office/drawing/2015/10/21/chartex" xmlns:cx3="http://schemas.microsoft.com/office/drawing/2016/5/9/chartex" xmlns:cx4="http://schemas.microsoft.com/office/drawing/2016/5/10/chartex" xmlns:cx5="http://schemas.microsoft.com/office/drawing/2016/5/11/chartex" xmlns:cx6="http://schemas.microsoft.com/office/drawing/2016/5/12/chartex" xmlns:cx7="http://schemas.microsoft.com/office/drawing/2016/5/13/chartex" xmlns:cx8="http://schemas.microsoft.com/office/drawing/2016/5/14/chartex" xmlns:mc="http://schemas.openxmlformats.org/markup-compatibility/2006" xmlns:aink="http://schemas.microsoft.com/office/drawing/2016/ink" xmlns:am3d="http://schemas.microsoft.com/office/drawing/2017/model3d" xmlns:o="urn:schemas-microsoft-com:office:office" xmlns:oel="http://schemas.microsoft.com/office/2019/extlst" xmlns:r="http://schemas.openxmlformats.org/officeDocument/2006/relationships" xmlns:m="http://schemas.openxmlformats.org/officeDocument/2006/math" xmlns:v="urn:schemas-microsoft-com:vml" xmlns:wp14="http://schemas.microsoft.com/office/word/2010/wordprocessingDrawing" xmlns:wp="http://schemas.openxmlformats.org/drawingml/2006/wordprocessingDrawing" xmlns:w10="urn:schemas-microsoft-com:office:word" xmlns:w="http://schemas.openxmlformats.org/wordprocessingml/2006/main" xmlns:w14="http://schemas.microsoft.com/office/word/2010/wordml" xmlns:w15="http://schemas.microsoft.com/office/word/2012/wordml" xmlns:w16cex="http://schemas.microsoft.com/office/word/2018/wordml/cex" xmlns:w16cid="http://schemas.microsoft.com/office/word/2016/wordml/cid" xmlns:w16="http://schemas.microsoft.com/office/word/2018/wordml" xmlns:w16du="http://schemas.microsoft.com/office/word/2023/wordml/word16du" xmlns:w16sdtdh="http://schemas.microsoft.com/office/word/2020/wordml/sdtdatahash" xmlns:w16sdtfl="http://schemas.microsoft.com/office/word/2024/wordml/sdtformatlock" xmlns:w16se="http://schemas.microsoft.com/office/word/2015/wordml/symex" xmlns:wpg="http://schemas.microsoft.com/office/word/2010/wordprocessingGroup" xmlns:wpi="http://schemas.microsoft.com/office/word/2010/wordprocessingInk" xmlns:wne="http://schemas.microsoft.com/office/word/2006/wordml" xmlns:wps="http://schemas.microsoft.com/office/word/2010/wordprocessingShape" mc:Ignorable="w14 w15 w16se w16cid w16 w16cex w16sdtdh w16sdtfl w16du wp14">
+<w:document xmlns:wpc="http://schemas.microsoft.com/office/word/2010/wordprocessingCanvas" xmlns:cx="http://schemas.microsoft.com/office/drawing/2014/chartex" xmlns:cx1="http://schemas.microsoft.com/office/drawing/2015/9/8/chartex" xmlns:cx2="http://schemas.microsoft.com/office/drawing/2015/10/21/chartex" xmlns:cx3="http://schemas.microsoft.com/office/drawing/2016/5/9/chartex" xmlns:cx4="http://schemas.microsoft.com/office/drawing/2016/5/10/chartex" xmlns:cx5="http://schemas.microsoft.com/office/drawing/2016/5/11/chartex" xmlns:cx6="http://schemas.microsoft.com/office/drawing/2016/5/12/chartex" xmlns:cx7="http://schemas.microsoft.com/office/drawing/2016/5/13/chartex" xmlns:cx8="http://schemas.microsoft.com/office/drawing/2016/5/14/chartex" xmlns:mc="http://schemas.openxmlformats.org/markup-compatibility/2006" xmlns:aink="http://schemas.microsoft.com/office/drawing/2016/ink" xmlns:am3d="http://schemas.microsoft.com/office/drawing/2017/model3d" xmlns:o="urn:schemas-microsoft-com:office:office" xmlns:oel="http://schemas.microsoft.com/office/2019/extlst" xmlns:r="http://schemas.openxmlformats.org/officeDocument/2006/relationships" xmlns:m="http://schemas.openxmlformats.org/officeDocument/2006/math" xmlns:v="urn:schemas-microsoft-com:vml" xmlns:wp14="http://schemas.microsoft.com/office/word/2010/wordprocessingDrawing" xmlns:wp="http://schemas.openxmlformats.org/drawingml/2006/wordprocessingDrawing" xmlns:w10="urn:schemas-microsoft-com:office:word" xmlns:w="http://schemas.openxmlformats.org/wordprocessingml/2006/main" xmlns:w14="http://schemas.microsoft.com/office/word/2010/wordml" xmlns:w15="http://schemas.microsoft.com/office/word/2012/wordml" xmlns:w16cex="http://schemas.microsoft.com/office/word/2018/wordml/cex" xmlns:w16cid="http://schemas.microsoft.com/office/word/2016/wordml/cid" xmlns:w16="http://schemas.microsoft.com/office/word/2018/wordml" xmlns:w16sdtdh="http://schemas.microsoft.com/office/word/2020/wordml/sdtdatahash" xmlns:w16se="http://schemas.microsoft.com/office/word/2015/wordml/symex" xmlns:wpg="http://schemas.microsoft.com/office/word/2010/wordprocessingGroup" xmlns:wpi="http://schemas.microsoft.com/office/word/2010/wordprocessingInk" xmlns:wne="http://schemas.microsoft.com/office/word/2006/wordml" xmlns:wps="http://schemas.microsoft.com/office/word/2010/wordprocessingShape" mc:Ignorable="w14 w15 w16se w16cid w16 w16cex w16sdtdh wp14">
   <w:body>
     <w:p>
       <w:r>
@@ -31,7 +31,23 @@
           <w:b/>
           <w:bCs/>
         </w:rPr>
-        <w:t xml:space="preserve"> Project Title: MOVIE RECOMMENDATION WEB APP</w:t>
+        <w:t xml:space="preserve"> Project Title: </w:t>
+      </w:r>
+      <w:proofErr w:type="spellStart"/>
+      <w:r>
+        <w:rPr>
+          <w:b/>
+          <w:bCs/>
+        </w:rPr>
+        <w:t>Structify</w:t>
+      </w:r>
+      <w:proofErr w:type="spellEnd"/>
+      <w:r>
+        <w:rPr>
+          <w:b/>
+          <w:bCs/>
+        </w:rPr>
+        <w:t xml:space="preserve"> – Folder Structure Replicator &amp; Comparator</w:t>
       </w:r>
       <w:r>
         <w:rPr>
@@ -56,7 +72,7 @@
         <w:t xml:space="preserve"> Project Timeline: </w:t>
       </w:r>
       <w:r>
-        <w:t>August 2023 – October 2023</w:t>
+        <w:t>January 2026</w:t>
       </w:r>
       <w:r>
         <w:br/>
@@ -70,34 +86,32 @@
       <w:r>
         <w:t xml:space="preserve"> YouTube Demo: </w:t>
       </w:r>
-      <w:hyperlink r:id="rId5" w:tgtFrame="_new" w:history="1">
+      <w:r>
+        <w:t>Not available</w:t>
+      </w:r>
+      <w:r>
+        <w:br/>
+      </w:r>
+      <w:r>
+        <w:rPr>
+          <w:rFonts w:ascii="Segoe UI Emoji" w:hAnsi="Segoe UI Emoji" w:cs="Segoe UI Emoji"/>
+        </w:rPr>
+        <w:t>📦</w:t>
+      </w:r>
+      <w:r>
+        <w:t xml:space="preserve"> GitHub Source Code: </w:t>
+      </w:r>
+      <w:hyperlink r:id="rId5" w:history="1">
         <w:r>
           <w:rPr>
             <w:rStyle w:val="Hyperlink"/>
           </w:rPr>
-          <w:t>https://youtu.be/YgA_rae6ojw</w:t>
+          <w:t>https://github.com/IvanSicaja/2025.11.14_GitHub_PRJ_Structify</w:t>
         </w:r>
       </w:hyperlink>
       <w:r>
-        <w:br/>
-      </w:r>
-      <w:r>
-        <w:rPr>
-          <w:rFonts w:ascii="Segoe UI Emoji" w:hAnsi="Segoe UI Emoji" w:cs="Segoe UI Emoji"/>
-        </w:rPr>
-        <w:t>📦</w:t>
-      </w:r>
-      <w:r>
-        <w:t xml:space="preserve"> GitHub Source Code: </w:t>
-      </w:r>
-      <w:hyperlink r:id="rId6" w:tgtFrame="_new" w:history="1">
-        <w:r>
-          <w:rPr>
-            <w:rStyle w:val="Hyperlink"/>
-          </w:rPr>
-          <w:t>https://github.com/IvanSicaja/2023.08.01_GitHub_Movie-Recommendation-Web-App</w:t>
-        </w:r>
-      </w:hyperlink>
+        <w:t xml:space="preserve"> </w:t>
+      </w:r>
       <w:r>
         <w:br/>
       </w:r>
@@ -148,7 +162,7 @@
       <w:r>
         <w:t xml:space="preserve"> GitHub Profile: </w:t>
       </w:r>
-      <w:hyperlink r:id="rId7" w:history="1">
+      <w:hyperlink r:id="rId6" w:history="1">
         <w:r>
           <w:rPr>
             <w:rStyle w:val="Hyperlink"/>
@@ -168,7 +182,7 @@
       <w:r>
         <w:t xml:space="preserve"> LinkedIn: </w:t>
       </w:r>
-      <w:hyperlink r:id="rId8" w:tgtFrame="_new" w:history="1">
+      <w:hyperlink r:id="rId7" w:tgtFrame="_new" w:history="1">
         <w:r>
           <w:rPr>
             <w:rStyle w:val="Hyperlink"/>
@@ -188,7 +202,7 @@
       <w:r>
         <w:t xml:space="preserve"> YouTube: </w:t>
       </w:r>
-      <w:hyperlink r:id="rId9" w:tgtFrame="_new" w:history="1">
+      <w:hyperlink r:id="rId8" w:tgtFrame="_new" w:history="1">
         <w:r>
           <w:rPr>
             <w:rStyle w:val="Hyperlink"/>
@@ -221,8 +235,16 @@
         <w:t xml:space="preserve"> description</w:t>
       </w:r>
       <w:r>
+        <w:t xml:space="preserve"> sections are </w:t>
+      </w:r>
+      <w:proofErr w:type="gramStart"/>
+      <w:r>
+        <w:t xml:space="preserve">bellow </w:t>
+      </w:r>
+      <w:r>
         <w:t>:</w:t>
       </w:r>
+      <w:proofErr w:type="gramEnd"/>
       <w:r>
         <w:t xml:space="preserve"> </w:t>
       </w:r>
@@ -768,15 +790,7 @@
         <w:t>Real-world applications</w:t>
       </w:r>
       <w:r>
-        <w:t xml:space="preserve"> </w:t>
-      </w:r>
-      <w:proofErr w:type="gramStart"/>
-      <w:r>
-        <w:t>would require</w:t>
-      </w:r>
-      <w:proofErr w:type="gramEnd"/>
-      <w:r>
-        <w:t xml:space="preserve"> </w:t>
+        <w:t xml:space="preserve"> would require </w:t>
       </w:r>
       <w:r>
         <w:rPr>
@@ -934,7 +948,7 @@
 </file>
 
 <file path=word/numbering.xml><?xml version="1.0" encoding="utf-8"?>
-<w:numbering xmlns:wpc="http://schemas.microsoft.com/office/word/2010/wordprocessingCanvas" xmlns:cx="http://schemas.microsoft.com/office/drawing/2014/chartex" xmlns:cx1="http://schemas.microsoft.com/office/drawing/2015/9/8/chartex" xmlns:cx2="http://schemas.microsoft.com/office/drawing/2015/10/21/chartex" xmlns:cx3="http://schemas.microsoft.com/office/drawing/2016/5/9/chartex" xmlns:cx4="http://schemas.microsoft.com/office/drawing/2016/5/10/chartex" xmlns:cx5="http://schemas.microsoft.com/office/drawing/2016/5/11/chartex" xmlns:cx6="http://schemas.microsoft.com/office/drawing/2016/5/12/chartex" xmlns:cx7="http://schemas.microsoft.com/office/drawing/2016/5/13/chartex" xmlns:cx8="http://schemas.microsoft.com/office/drawing/2016/5/14/chartex" xmlns:mc="http://schemas.openxmlformats.org/markup-compatibility/2006" xmlns:aink="http://schemas.microsoft.com/office/drawing/2016/ink" xmlns:am3d="http://schemas.microsoft.com/office/drawing/2017/model3d" xmlns:o="urn:schemas-microsoft-com:office:office" xmlns:oel="http://schemas.microsoft.com/office/2019/extlst" xmlns:r="http://schemas.openxmlformats.org/officeDocument/2006/relationships" xmlns:m="http://schemas.openxmlformats.org/officeDocument/2006/math" xmlns:v="urn:schemas-microsoft-com:vml" xmlns:wp14="http://schemas.microsoft.com/office/word/2010/wordprocessingDrawing" xmlns:wp="http://schemas.openxmlformats.org/drawingml/2006/wordprocessingDrawing" xmlns:w10="urn:schemas-microsoft-com:office:word" xmlns:w="http://schemas.openxmlformats.org/wordprocessingml/2006/main" xmlns:w14="http://schemas.microsoft.com/office/word/2010/wordml" xmlns:w15="http://schemas.microsoft.com/office/word/2012/wordml" xmlns:w16cex="http://schemas.microsoft.com/office/word/2018/wordml/cex" xmlns:w16cid="http://schemas.microsoft.com/office/word/2016/wordml/cid" xmlns:w16="http://schemas.microsoft.com/office/word/2018/wordml" xmlns:w16du="http://schemas.microsoft.com/office/word/2023/wordml/word16du" xmlns:w16sdtdh="http://schemas.microsoft.com/office/word/2020/wordml/sdtdatahash" xmlns:w16sdtfl="http://schemas.microsoft.com/office/word/2024/wordml/sdtformatlock" xmlns:w16se="http://schemas.microsoft.com/office/word/2015/wordml/symex" xmlns:wpg="http://schemas.microsoft.com/office/word/2010/wordprocessingGroup" xmlns:wpi="http://schemas.microsoft.com/office/word/2010/wordprocessingInk" xmlns:wne="http://schemas.microsoft.com/office/word/2006/wordml" xmlns:wps="http://schemas.microsoft.com/office/word/2010/wordprocessingShape" mc:Ignorable="w14 w15 w16se w16cid w16 w16cex w16sdtdh w16sdtfl w16du wp14">
+<w:numbering xmlns:wpc="http://schemas.microsoft.com/office/word/2010/wordprocessingCanvas" xmlns:cx="http://schemas.microsoft.com/office/drawing/2014/chartex" xmlns:cx1="http://schemas.microsoft.com/office/drawing/2015/9/8/chartex" xmlns:cx2="http://schemas.microsoft.com/office/drawing/2015/10/21/chartex" xmlns:cx3="http://schemas.microsoft.com/office/drawing/2016/5/9/chartex" xmlns:cx4="http://schemas.microsoft.com/office/drawing/2016/5/10/chartex" xmlns:cx5="http://schemas.microsoft.com/office/drawing/2016/5/11/chartex" xmlns:cx6="http://schemas.microsoft.com/office/drawing/2016/5/12/chartex" xmlns:cx7="http://schemas.microsoft.com/office/drawing/2016/5/13/chartex" xmlns:cx8="http://schemas.microsoft.com/office/drawing/2016/5/14/chartex" xmlns:mc="http://schemas.openxmlformats.org/markup-compatibility/2006" xmlns:aink="http://schemas.microsoft.com/office/drawing/2016/ink" xmlns:am3d="http://schemas.microsoft.com/office/drawing/2017/model3d" xmlns:o="urn:schemas-microsoft-com:office:office" xmlns:oel="http://schemas.microsoft.com/office/2019/extlst" xmlns:r="http://schemas.openxmlformats.org/officeDocument/2006/relationships" xmlns:m="http://schemas.openxmlformats.org/officeDocument/2006/math" xmlns:v="urn:schemas-microsoft-com:vml" xmlns:wp14="http://schemas.microsoft.com/office/word/2010/wordprocessingDrawing" xmlns:wp="http://schemas.openxmlformats.org/drawingml/2006/wordprocessingDrawing" xmlns:w10="urn:schemas-microsoft-com:office:word" xmlns:w="http://schemas.openxmlformats.org/wordprocessingml/2006/main" xmlns:w14="http://schemas.microsoft.com/office/word/2010/wordml" xmlns:w15="http://schemas.microsoft.com/office/word/2012/wordml" xmlns:w16cex="http://schemas.microsoft.com/office/word/2018/wordml/cex" xmlns:w16cid="http://schemas.microsoft.com/office/word/2016/wordml/cid" xmlns:w16="http://schemas.microsoft.com/office/word/2018/wordml" xmlns:w16sdtdh="http://schemas.microsoft.com/office/word/2020/wordml/sdtdatahash" xmlns:w16se="http://schemas.microsoft.com/office/word/2015/wordml/symex" xmlns:wpg="http://schemas.microsoft.com/office/word/2010/wordprocessingGroup" xmlns:wpi="http://schemas.microsoft.com/office/word/2010/wordprocessingInk" xmlns:wne="http://schemas.microsoft.com/office/word/2006/wordml" xmlns:wps="http://schemas.microsoft.com/office/word/2010/wordprocessingShape" mc:Ignorable="w14 w15 w16se w16cid w16 w16cex w16sdtdh wp14">
   <w:abstractNum w:abstractNumId="0" w15:restartNumberingAfterBreak="0">
     <w:nsid w:val="0FC65B8A"/>
     <w:multiLevelType w:val="multilevel"/>
@@ -3202,7 +3216,7 @@
 </file>
 
 <file path=word/styles.xml><?xml version="1.0" encoding="utf-8"?>
-<w:styles xmlns:mc="http://schemas.openxmlformats.org/markup-compatibility/2006" xmlns:r="http://schemas.openxmlformats.org/officeDocument/2006/relationships" xmlns:w="http://schemas.openxmlformats.org/wordprocessingml/2006/main" xmlns:w14="http://schemas.microsoft.com/office/word/2010/wordml" xmlns:w15="http://schemas.microsoft.com/office/word/2012/wordml" xmlns:w16cex="http://schemas.microsoft.com/office/word/2018/wordml/cex" xmlns:w16cid="http://schemas.microsoft.com/office/word/2016/wordml/cid" xmlns:w16="http://schemas.microsoft.com/office/word/2018/wordml" xmlns:w16du="http://schemas.microsoft.com/office/word/2023/wordml/word16du" xmlns:w16sdtdh="http://schemas.microsoft.com/office/word/2020/wordml/sdtdatahash" xmlns:w16sdtfl="http://schemas.microsoft.com/office/word/2024/wordml/sdtformatlock" xmlns:w16se="http://schemas.microsoft.com/office/word/2015/wordml/symex" mc:Ignorable="w14 w15 w16se w16cid w16 w16cex w16sdtdh w16sdtfl w16du">
+<w:styles xmlns:mc="http://schemas.openxmlformats.org/markup-compatibility/2006" xmlns:r="http://schemas.openxmlformats.org/officeDocument/2006/relationships" xmlns:w="http://schemas.openxmlformats.org/wordprocessingml/2006/main" xmlns:w14="http://schemas.microsoft.com/office/word/2010/wordml" xmlns:w15="http://schemas.microsoft.com/office/word/2012/wordml" xmlns:w16cex="http://schemas.microsoft.com/office/word/2018/wordml/cex" xmlns:w16cid="http://schemas.microsoft.com/office/word/2016/wordml/cid" xmlns:w16="http://schemas.microsoft.com/office/word/2018/wordml" xmlns:w16sdtdh="http://schemas.microsoft.com/office/word/2020/wordml/sdtdatahash" xmlns:w16se="http://schemas.microsoft.com/office/word/2015/wordml/symex" mc:Ignorable="w14 w15 w16se w16cid w16 w16cex w16sdtdh">
   <w:docDefaults>
     <w:rPrDefault>
       <w:rPr>
@@ -3816,7 +3830,6 @@
   <w:style w:type="character" w:default="1" w:styleId="DefaultParagraphFont">
     <w:name w:val="Default Paragraph Font"/>
     <w:uiPriority w:val="1"/>
-    <w:semiHidden/>
     <w:unhideWhenUsed/>
   </w:style>
   <w:style w:type="table" w:default="1" w:styleId="TableNormal">

</xml_diff>